<commit_message>
flat_roof sources-for-Elena: refresh abutment length + fix ЗСР/НР/СП claims
Rebuilt from a fresh Sheet download (estimate_20260827_154011.xlsx) after
Elena's own abutment-length correction on sheet 01: примыкание now shows
her real 138.62 мп (was 128, the coarser spec-table sum), rails 141 мп.
Also corrects the earlier claim that ЗСР/Накладные/Сметная прибыль are all
non-zero and important - checked Elena's real formulas directly: Накладные/
Прибыль have no formula at all in the grey/internal columns (blank = 0,
same as our output), only ЗСР is a real internal amount (15000₽, a manual
per-project field like technical_supervision_amount that just isn't filled
in for this project). Verified all 28 rows against the freshly-exported
estimate workbook's column J - 0 mismatches.

Co-Authored-By: Claude Sonnet 5 <noreply@anthropic.com>
</commit_message>
<xml_diff>
--- a/experiments/full_estimate_review_pipeline/reports/usv_vs_original_comparison/06_flat_roof_sources_for_elena.docx
+++ b/experiments/full_estimate_review_pipeline/reports/usv_vs_original_comparison/06_flat_roof_sources_for_elena.docx
@@ -436,7 +436,7 @@
           </w:tcPr>
           <w:p>
             <w:r>
-              <w:t>128,00 мп</w:t>
+              <w:t>138,62 мп</w:t>
             </w:r>
           </w:p>
         </w:tc>
@@ -446,7 +446,7 @@
           </w:tcPr>
           <w:p>
             <w:r>
-              <w:t>Из проекта напрямую - сумма двух готовых строк спецификации PDF: «Длина примыкания к парапетам» (103.35 мп) + «Длина примыкания к стенам» (24.65 мп) = 128 мп. Заполнено на листе 01 (было 0 - данные распознаны при извлечении, но не были привязаны ни к одной зоне кровли, см. отчёт 06_flat_roof.md находка №2). Не совпадает с Еленой точно (у неё 138.62 мп) - её собственный расчёт по чертежу отдельно на каждый этаж, а не готовые числа спецификации.</w:t>
+              <w:t>Из проекта напрямую - её собственный расчёт по чертежу отдельно на каждый этаж (парапет 1 этаж 96 + парапет 2 этаж 35.4 + примыкания к ВК/стенам 1 этаж 4.68 + 2 этаж 2.54 = 138.62 мп), вписан на листе 01 вместо готовых строк спецификации (103.35+24.65=128 мп), которые оказались более грубым числом - тот же паттерн, что и с площадью кровли, см. отчёт 06_flat_roof.md находки №1-2. Точное совпадение с Еленой.</w:t>
             </w:r>
           </w:p>
         </w:tc>
@@ -468,7 +468,7 @@
           </w:tcPr>
           <w:p>
             <w:r>
-              <w:t>128,00 мп</w:t>
+              <w:t>138,62 мп</w:t>
             </w:r>
           </w:p>
         </w:tc>
@@ -500,7 +500,7 @@
           </w:tcPr>
           <w:p>
             <w:r>
-              <w:t>129,00 мп</w:t>
+              <w:t>141,00 мп</w:t>
             </w:r>
           </w:p>
         </w:tc>
@@ -510,7 +510,7 @@
           </w:tcPr>
           <w:p>
             <w:r>
-              <w:t>Посчитано. Длина примыканий (128 мп) округлена вверх до кратности 3-метрового куска: 128/3=42.67 -&gt; 43 куска x 3 = 129 мп.</w:t>
+              <w:t>Посчитано. Длина примыканий (138.62 мп) округлена вверх до кратности 3-метрового куска: 138.62/3=46.21 -&gt; 47 кусков x 3 = 141 мп.</w:t>
             </w:r>
           </w:p>
         </w:tc>
@@ -532,7 +532,7 @@
           </w:tcPr>
           <w:p>
             <w:r>
-              <w:t>129,00 мп</w:t>
+              <w:t>141,00 мп</w:t>
             </w:r>
           </w:p>
         </w:tc>
@@ -574,7 +574,7 @@
           </w:tcPr>
           <w:p>
             <w:r>
-              <w:t>Посчитано. Требуемая площадь = площадь кровли (248.92 м2) x коэффициент запаса + длина примыканий (128 мп) x коэффициент запаса, делённая на площадь рулона (2.1м x 20м = 42 м2), округление вверх = 11 рулонов.</w:t>
+              <w:t>Посчитано. Требуемая площадь = площадь кровли (248.92 м2) x коэффициент запаса (1.15) + длина примыканий (138.62 мп) x коэффициент запаса (1.1) = 438.74 м2, делённая на площадь рулона (2.1м x 20м = 42 м2), округление вверх = 11 рулонов.</w:t>
             </w:r>
           </w:p>
         </w:tc>
@@ -894,7 +894,7 @@
           </w:tcPr>
           <w:p>
             <w:r>
-              <w:t>Строка есть для структуры сметы, у нас всегда 0 - считаем только внутреннюю себестоимость, без клиентской наценки.</w:t>
+              <w:t>Ручное поле (тот же механизм, что технический надзор) - по умолчанию 0, для этого проекта не заполнено. У Елены реально 15 000₽ во внутренней себестоимости (не наценка) - см. отчёт 06_flat_roof.md находка №7, стоит вписать.</w:t>
             </w:r>
           </w:p>
         </w:tc>
@@ -926,7 +926,7 @@
           </w:tcPr>
           <w:p>
             <w:r>
-              <w:t>Та же логика - 0, без наценки.</w:t>
+              <w:t>Строка есть для структуры сметы, у нас всегда 0. У Елены тоже реально 0 во внутренней себестоимости - видимое в её смете крупное число это клиентская наценка по коэффициенту НР, отдельная от серых/внутренних столбцов, не про эту строку.</w:t>
             </w:r>
           </w:p>
         </w:tc>
@@ -958,7 +958,7 @@
           </w:tcPr>
           <w:p>
             <w:r>
-              <w:t>Та же логика - 0, без наценки.</w:t>
+              <w:t>Та же логика, что накладные расходы - у обеих сторон реально 0 во внутренней себестоимости, видимое у Елены число это клиентская наценка по коэффициенту СП.</w:t>
             </w:r>
           </w:p>
         </w:tc>
@@ -980,7 +980,7 @@
         <w:t xml:space="preserve">Из проекта (спецификация PDF): </w:t>
       </w:r>
       <w:r>
-        <w:t>длина примыканий к парапетам и к стенам (заполнено вручную под готовые числа спецификации, т.к. извлечение их не привязало ни к одной зоне).</w:t>
+        <w:t>ничего в этом разделе больше не берётся напрямую из готовых строк спецификации - площадь кровли и длина примыканий оба заменены на собственный расчёт Елены по чертежу (см. ниже), он оказался точнее.</w:t>
       </w:r>
     </w:p>
     <w:p>
@@ -991,7 +991,7 @@
         <w:t xml:space="preserve">Ручные поля (по умолчанию, можно менять под проект): </w:t>
       </w:r>
       <w:r>
-        <w:t>объёмы SLOPE-плит разуклонки (по расчёту поставщика/расчётной организации, не из архитектурного PDF), ЭППС 50мм, количество аэраторов/воронок, высота водостока на воронку (3.75м), подъём краном, вывоз мусора, технический надзор.</w:t>
+        <w:t>объёмы SLOPE-плит разуклонки (по расчёту поставщика/расчётной организации, не из архитектурного PDF), ЭППС 50мм, количество аэраторов/воронок, высота водостока на воронку (3.75м), подъём краном, вывоз мусора, технический надзор, заготовительно-складские расходы (для этого проекта пока не заполнено, см. находку №7).</w:t>
       </w:r>
     </w:p>
     <w:p>
@@ -1002,7 +1002,7 @@
         <w:t xml:space="preserve">Вручную поправлено конкретно по этому проекту (лист 01, поверх найденного): </w:t>
       </w:r>
       <w:r>
-        <w:t>площадь обеих зон кровли (+3.480: 212.35→177.52 м2, +4.680: 82→71.4 м2 — под собственный расчёт Елены по чертежу, не готовую строку спецификации), длина примыканий зоны +3.480 (0→103.35 мп парапет, 0→24.65 мп стены/ВК — готовые числа спецификации, ранее не долетевшие до листа 01).</w:t>
+        <w:t>площадь обеих зон кровли (+3.480: 212.35→177.52 м2, +4.680: 82→71.4 м2), длина примыканий (готовые строки спецификации 103.35+24.65=128 мп → её собственный расчёт по чертежу 131.4 мп парапетов + 7.22 мп примыканий к стенам/ВК = 138.62 мп) - в обоих случаях собственный расчёт Елены по чертежу оказался точнее готовой строки спецификации, см. отчёт 06_flat_roof.md находки №1-2.</w:t>
       </w:r>
     </w:p>
     <w:sectPr>

</xml_diff>

<commit_message>
flat_roof: correct finding №7 - ЗСР field is hidden, not the ТН mechanism
Checked git history: procurement_storage_work_total was shown on sheet 01
until 2026-08-03, then hidden (show_to_user: false) when production moved
to a coefficient formula, and never restored when that formula was reverted
2026-08-24. It is not the same mechanism as technical_supervision_amount (a
plain universal default) - there's no sheet-01 path to fill it per project
right now. Per user decision, left as-is: fillable by hand directly in the
finished estimate when a specific project needs it, no code/contract change.

Co-Authored-By: Claude Sonnet 5 <noreply@anthropic.com>
</commit_message>
<xml_diff>
--- a/experiments/full_estimate_review_pipeline/reports/usv_vs_original_comparison/06_flat_roof_sources_for_elena.docx
+++ b/experiments/full_estimate_review_pipeline/reports/usv_vs_original_comparison/06_flat_roof_sources_for_elena.docx
@@ -894,7 +894,7 @@
           </w:tcPr>
           <w:p>
             <w:r>
-              <w:t>Ручное поле (тот же механизм, что технический надзор) - по умолчанию 0, для этого проекта не заполнено. У Елены реально 15 000₽ во внутренней себестоимости (не наценка) - см. отчёт 06_flat_roof.md находка №7, стоит вписать.</w:t>
+              <w:t>По умолчанию 0 (legacy-поле, скрыто с листа 01). У Елены реально 15 000₽ во внутренней себестоимости (не наценка) - см. отчёт 06_flat_roof.md находка №7. Не баг, при необходимости можно вписать вручную прямо в готовую смету.</w:t>
             </w:r>
           </w:p>
         </w:tc>
@@ -991,7 +991,7 @@
         <w:t xml:space="preserve">Ручные поля (по умолчанию, можно менять под проект): </w:t>
       </w:r>
       <w:r>
-        <w:t>объёмы SLOPE-плит разуклонки (по расчёту поставщика/расчётной организации, не из архитектурного PDF), ЭППС 50мм, количество аэраторов/воронок, высота водостока на воронку (3.75м), подъём краном, вывоз мусора, технический надзор, заготовительно-складские расходы (для этого проекта пока не заполнено, см. находку №7).</w:t>
+        <w:t>объёмы SLOPE-плит разуклонки (по расчёту поставщика/расчётной организации, не из архитектурного PDF), ЭППС 50мм, количество аэраторов/воронок, высота водостока на воронку (3.75м), подъём краном, вывоз мусора, технический надзор (универсальный дефолт 10000₽). Заготовительно-складские расходы по умолчанию 0 (см. находку №7) - при необходимости вписываются вручную прямо в готовую смету, не через лист 01.</w:t>
       </w:r>
     </w:p>
     <w:p>

</xml_diff>

<commit_message>
flat_roof sources-for-Elena: rebuild docx, strip internal report references
This doc goes to the estimator (Elena) directly - she never sees the
internal 06_flat_roof.md review report or its numbered findings, so every
row's explanation must be self-contained instead of pointing at "находка
№N" / the report filename.

Co-Authored-By: Claude Sonnet 5 <noreply@anthropic.com>
</commit_message>
<xml_diff>
--- a/experiments/full_estimate_review_pipeline/reports/usv_vs_original_comparison/06_flat_roof_sources_for_elena.docx
+++ b/experiments/full_estimate_review_pipeline/reports/usv_vs_original_comparison/06_flat_roof_sources_for_elena.docx
@@ -94,7 +94,7 @@
           </w:tcPr>
           <w:p>
             <w:r>
-              <w:t>Посчитано. Сумма площадей обеих зон кровли: +3.480 (177.52 м2) + +4.680 (71.4 м2) = 248.92 м2 - исправлено на листе 01 под собственный расчёт Елены по чертежу (была готовая площадь спецификации 212.35+82=294.35, см. отчёт 06_flat_roof.md находка №1).</w:t>
+              <w:t>Посчитано. Сумма площадей обеих зон кровли: +3.480 (177.52 м2) + +4.680 (71.4 м2) = 248.92 м2 - площадь по собственному расчёту Елены по чертежу.</w:t>
             </w:r>
           </w:p>
         </w:tc>
@@ -446,7 +446,7 @@
           </w:tcPr>
           <w:p>
             <w:r>
-              <w:t>Из проекта напрямую - её собственный расчёт по чертежу отдельно на каждый этаж (парапет 1 этаж 96 + парапет 2 этаж 35.4 + примыкания к ВК/стенам 1 этаж 4.68 + 2 этаж 2.54 = 138.62 мп), вписан на листе 01 вместо готовых строк спецификации (103.35+24.65=128 мп), которые оказались более грубым числом - тот же паттерн, что и с площадью кровли, см. отчёт 06_flat_roof.md находки №1-2. Точное совпадение с Еленой.</w:t>
+              <w:t>Из проекта напрямую - собственный расчёт Елены по чертежу отдельно на каждый этаж (парапет 1 этаж 96 + парапет 2 этаж 35.4 + примыкания к ВК/стенам 1 этаж 4.68 + 2 этаж 2.54 = 138.62 мп).</w:t>
             </w:r>
           </w:p>
         </w:tc>
@@ -894,7 +894,7 @@
           </w:tcPr>
           <w:p>
             <w:r>
-              <w:t>По умолчанию 0 (legacy-поле, скрыто с листа 01). У Елены реально 15 000₽ во внутренней себестоимости (не наценка) - см. отчёт 06_flat_roof.md находка №7. Не баг, при необходимости можно вписать вручную прямо в готовую смету.</w:t>
+              <w:t>По умолчанию 0. При необходимости сумму можно вписать вручную прямо в готовую смету.</w:t>
             </w:r>
           </w:p>
         </w:tc>
@@ -991,7 +991,7 @@
         <w:t xml:space="preserve">Ручные поля (по умолчанию, можно менять под проект): </w:t>
       </w:r>
       <w:r>
-        <w:t>объёмы SLOPE-плит разуклонки (по расчёту поставщика/расчётной организации, не из архитектурного PDF), ЭППС 50мм, количество аэраторов/воронок, высота водостока на воронку (3.75м), подъём краном, вывоз мусора, технический надзор (универсальный дефолт 10000₽). Заготовительно-складские расходы по умолчанию 0 (см. находку №7) - при необходимости вписываются вручную прямо в готовую смету, не через лист 01.</w:t>
+        <w:t>объёмы SLOPE-плит разуклонки (по расчёту поставщика/расчётной организации, не из архитектурного PDF), ЭППС 50мм, количество аэраторов/воронок, высота водостока на воронку (3.75м), подъём краном, вывоз мусора, технический надзор (10000₽ по умолчанию), заготовительно-складские расходы (0 по умолчанию, вписывается вручную при необходимости).</w:t>
       </w:r>
     </w:p>
     <w:p>
@@ -1002,7 +1002,7 @@
         <w:t xml:space="preserve">Вручную поправлено конкретно по этому проекту (лист 01, поверх найденного): </w:t>
       </w:r>
       <w:r>
-        <w:t>площадь обеих зон кровли (+3.480: 212.35→177.52 м2, +4.680: 82→71.4 м2), длина примыканий (готовые строки спецификации 103.35+24.65=128 мп → её собственный расчёт по чертежу 131.4 мп парапетов + 7.22 мп примыканий к стенам/ВК = 138.62 мп) - в обоих случаях собственный расчёт Елены по чертежу оказался точнее готовой строки спецификации, см. отчёт 06_flat_roof.md находки №1-2.</w:t>
+        <w:t>площадь обеих зон кровли (+3.480: 212.35→177.52 м2, +4.680: 82→71.4 м2) и длина примыканий (131.4 мп парапетов + 7.22 мп примыканий к стенам/ВК = 138.62 мп) - в обоих случаях под собственный расчёт Елены по чертежу.</w:t>
       </w:r>
     </w:p>
     <w:sectPr>

</xml_diff>